<commit_message>
Update assignments for Fall 2026
</commit_message>
<xml_diff>
--- a/Assignments/Final Project Rubric.docx
+++ b/Assignments/Final Project Rubric.docx
@@ -7,7 +7,7 @@
         <w:jc w:val="center"/>
       </w:pPr>
       <w:r>
-        <w:t>Physics 441/541 Final Project Rubric</w:t>
+        <w:t>PHYS 441/541 Final Project Rubric</w:t>
       </w:r>
     </w:p>
     <w:p>
@@ -39,16 +39,12 @@
         </w:numPr>
       </w:pPr>
       <w:r>
-        <w:t xml:space="preserve">You have a simulation of your own design that runs (5 points), within a </w:t>
+        <w:t>The submission includes a functioning simulation of the student's own design, implemented in a Jupyter Notebook (5 points).</w:t>
       </w:r>
       <w:proofErr w:type="spellStart"/>
-      <w:r>
-        <w:t>Jupyter</w:t>
-      </w:r>
+      <w:r/>
       <w:proofErr w:type="spellEnd"/>
-      <w:r>
-        <w:t xml:space="preserve"> Notebook.</w:t>
-      </w:r>
+      <w:r/>
     </w:p>
     <w:p>
       <w:pPr>
@@ -59,16 +55,12 @@
         </w:numPr>
       </w:pPr>
       <w:r>
-        <w:t xml:space="preserve">You have provided documentation (in a </w:t>
+        <w:t>The notebook clearly documents what the simulation does, how it works, and the relevant principles of physics, computer science, and/or data science (10 points).</w:t>
       </w:r>
       <w:proofErr w:type="spellStart"/>
-      <w:r>
-        <w:t>Jupyter</w:t>
-      </w:r>
+      <w:r/>
       <w:proofErr w:type="spellEnd"/>
-      <w:r>
-        <w:t xml:space="preserve"> Notebook) that describes what the simulation does and how it does it.  Mention specifically the principles of physics and/or computer science and/or data science that are the basis for the simulation.</w:t>
-      </w:r>
+      <w:r/>
     </w:p>
     <w:p>
       <w:pPr>
@@ -127,7 +119,7 @@
         </w:numPr>
       </w:pPr>
       <w:r>
-        <w:t>Originality:  Is this simulation out there on the web already, or is this something that we have not seen before?</w:t>
+        <w:t>Originality: To what extent does the project develop or extend an idea beyond readily available examples?</w:t>
       </w:r>
     </w:p>
     <w:p>
@@ -175,7 +167,7 @@
         </w:numPr>
       </w:pPr>
       <w:r>
-        <w:t>Interactivity:  Does the simulation encourage/enable the user to interact with it in a productive way, for example, by allowing to adjust input parameter values and/or input data?</w:t>
+        <w:t>Interactivity: Does the simulation support productive user interaction, such as adjusting input parameters or data?</w:t>
       </w:r>
     </w:p>
     <w:p>
@@ -256,7 +248,7 @@
         </w:numPr>
       </w:pPr>
       <w:r>
-        <w:t>Multiple Representations:  Does the simulation Include more than one way to get the information across.  For instance, the simulation could include a real-world visualization, and/or have graphs in multiple formats.</w:t>
+        <w:t>Multiple representations: Does the simulation communicate its results in more than one useful way, such as a physical visualization and complementary plots?</w:t>
       </w:r>
     </w:p>
     <w:p>
@@ -331,7 +323,7 @@
         </w:numPr>
       </w:pPr>
       <w:r>
-        <w:t>Degree of Difficulty:  based on the difficulty level of creating the simulation.</w:t>
+        <w:t>Degree of difficulty: How technically and conceptually challenging was the simulation to create?</w:t>
       </w:r>
     </w:p>
     <w:p>
@@ -379,7 +371,7 @@
         </w:numPr>
       </w:pPr>
       <w:r>
-        <w:t>Programming skill:  How was the program implemented?  Was the simulation developed in the clearest/simplest/most efficient way, or was it unnecessarily complicated?</w:t>
+        <w:t>Programming quality: Is the implementation clear, appropriately simple, correct, and computationally efficient?</w:t>
       </w:r>
     </w:p>
     <w:p>

</xml_diff>